<commit_message>
Chỉnh sửa form báo cáo TNLĐ
</commit_message>
<xml_diff>
--- a/fe/public/template.docx
+++ b/fe/public/template.docx
@@ -1,6 +1,6 @@
 
 <file path=word/document.xml><?xml version="1.0" encoding="utf-8"?>
-<w:document xmlns:wpc="http://schemas.microsoft.com/office/word/2010/wordprocessingCanvas" xmlns:cx="http://schemas.microsoft.com/office/drawing/2014/chartex" xmlns:cx1="http://schemas.microsoft.com/office/drawing/2015/9/8/chartex" xmlns:mc="http://schemas.openxmlformats.org/markup-compatibility/2006" xmlns:o="urn:schemas-microsoft-com:office:office" xmlns:r="http://schemas.openxmlformats.org/officeDocument/2006/relationships" xmlns:m="http://schemas.openxmlformats.org/officeDocument/2006/math" xmlns:v="urn:schemas-microsoft-com:vml" xmlns:wp14="http://schemas.microsoft.com/office/word/2010/wordprocessingDrawing" xmlns:wp="http://schemas.openxmlformats.org/drawingml/2006/wordprocessingDrawing" xmlns:w10="urn:schemas-microsoft-com:office:word" xmlns:w="http://schemas.openxmlformats.org/wordprocessingml/2006/main" xmlns:w14="http://schemas.microsoft.com/office/word/2010/wordml" xmlns:w15="http://schemas.microsoft.com/office/word/2012/wordml" xmlns:w16se="http://schemas.microsoft.com/office/word/2015/wordml/symex" xmlns:wpg="http://schemas.microsoft.com/office/word/2010/wordprocessingGroup" xmlns:wpi="http://schemas.microsoft.com/office/word/2010/wordprocessingInk" xmlns:wne="http://schemas.microsoft.com/office/word/2006/wordml" xmlns:wps="http://schemas.microsoft.com/office/word/2010/wordprocessingShape" mc:Ignorable="w14 w15 w16se wp14">
+<w:document xmlns:wpc="http://schemas.microsoft.com/office/word/2010/wordprocessingCanvas" xmlns:cx="http://schemas.microsoft.com/office/drawing/2014/chartex" xmlns:cx1="http://schemas.microsoft.com/office/drawing/2015/9/8/chartex" xmlns:cx2="http://schemas.microsoft.com/office/drawing/2015/10/21/chartex" xmlns:cx3="http://schemas.microsoft.com/office/drawing/2016/5/9/chartex" xmlns:cx4="http://schemas.microsoft.com/office/drawing/2016/5/10/chartex" xmlns:cx5="http://schemas.microsoft.com/office/drawing/2016/5/11/chartex" xmlns:cx6="http://schemas.microsoft.com/office/drawing/2016/5/12/chartex" xmlns:cx7="http://schemas.microsoft.com/office/drawing/2016/5/13/chartex" xmlns:cx8="http://schemas.microsoft.com/office/drawing/2016/5/14/chartex" xmlns:mc="http://schemas.openxmlformats.org/markup-compatibility/2006" xmlns:aink="http://schemas.microsoft.com/office/drawing/2016/ink" xmlns:am3d="http://schemas.microsoft.com/office/drawing/2017/model3d" xmlns:o="urn:schemas-microsoft-com:office:office" xmlns:oel="http://schemas.microsoft.com/office/2019/extlst" xmlns:r="http://schemas.openxmlformats.org/officeDocument/2006/relationships" xmlns:m="http://schemas.openxmlformats.org/officeDocument/2006/math" xmlns:v="urn:schemas-microsoft-com:vml" xmlns:wp14="http://schemas.microsoft.com/office/word/2010/wordprocessingDrawing" xmlns:wp="http://schemas.openxmlformats.org/drawingml/2006/wordprocessingDrawing" xmlns:w10="urn:schemas-microsoft-com:office:word" xmlns:w="http://schemas.openxmlformats.org/wordprocessingml/2006/main" xmlns:w14="http://schemas.microsoft.com/office/word/2010/wordml" xmlns:w15="http://schemas.microsoft.com/office/word/2012/wordml" xmlns:w16cex="http://schemas.microsoft.com/office/word/2018/wordml/cex" xmlns:w16cid="http://schemas.microsoft.com/office/word/2016/wordml/cid" xmlns:w16="http://schemas.microsoft.com/office/word/2018/wordml" xmlns:w16du="http://schemas.microsoft.com/office/word/2023/wordml/word16du" xmlns:w16sdtdh="http://schemas.microsoft.com/office/word/2020/wordml/sdtdatahash" xmlns:w16sdtfl="http://schemas.microsoft.com/office/word/2024/wordml/sdtformatlock" xmlns:w16se="http://schemas.microsoft.com/office/word/2015/wordml/symex" xmlns:wpg="http://schemas.microsoft.com/office/word/2010/wordprocessingGroup" xmlns:wpi="http://schemas.microsoft.com/office/word/2010/wordprocessingInk" xmlns:wne="http://schemas.microsoft.com/office/word/2006/wordml" xmlns:wps="http://schemas.microsoft.com/office/word/2010/wordprocessingShape" mc:Ignorable="w14 w15 w16se w16cid w16 w16cex w16sdtdh w16sdtfl w16du wp14">
   <w:body>
     <w:p>
       <w:pPr>
@@ -98,7 +98,7 @@
     </w:p>
     <w:tbl>
       <w:tblPr>
-        <w:tblW w:w="8640" w:type="dxa"/>
+        <w:tblW w:w="2878" w:type="dxa"/>
         <w:tblCellSpacing w:w="0" w:type="dxa"/>
         <w:tblBorders>
           <w:top w:val="outset" w:sz="6" w:space="0" w:color="auto"/>
@@ -114,12 +114,7 @@
         <w:tblLook w:val="04A0" w:firstRow="1" w:lastRow="0" w:firstColumn="1" w:lastColumn="0" w:noHBand="0" w:noVBand="1"/>
       </w:tblPr>
       <w:tblGrid>
-        <w:gridCol w:w="2877"/>
-        <w:gridCol w:w="4135"/>
-        <w:gridCol w:w="407"/>
-        <w:gridCol w:w="407"/>
-        <w:gridCol w:w="407"/>
-        <w:gridCol w:w="407"/>
+        <w:gridCol w:w="2878"/>
       </w:tblGrid>
       <w:tr>
         <w:trPr>
@@ -127,7 +122,7 @@
         </w:trPr>
         <w:tc>
           <w:tcPr>
-            <w:tcW w:w="2880" w:type="dxa"/>
+            <w:tcW w:w="2878" w:type="dxa"/>
             <w:tcBorders>
               <w:top w:val="nil"/>
               <w:left w:val="nil"/>
@@ -156,192 +151,6 @@
                 <w:lang w:val="vi-VN"/>
               </w:rPr>
               <w:t>Địa chỉ: {companyAddress}</w:t>
-            </w:r>
-          </w:p>
-        </w:tc>
-        <w:tc>
-          <w:tcPr>
-            <w:tcW w:w="4137" w:type="dxa"/>
-            <w:tcBorders>
-              <w:top w:val="nil"/>
-              <w:left w:val="nil"/>
-              <w:bottom w:val="nil"/>
-              <w:right w:val="single" w:sz="8" w:space="0" w:color="auto"/>
-            </w:tcBorders>
-            <w:shd w:val="clear" w:color="auto" w:fill="FFFFFF"/>
-            <w:hideMark/>
-          </w:tcPr>
-          <w:p>
-            <w:pPr>
-              <w:spacing w:before="120" w:after="120" w:line="234" w:lineRule="atLeast"/>
-              <w:rPr>
-                <w:rFonts w:eastAsia="Times New Roman" w:cs="Times New Roman"/>
-                <w:color w:val="000000"/>
-                <w:sz w:val="24"/>
-                <w:szCs w:val="24"/>
-              </w:rPr>
-            </w:pPr>
-            <w:r>
-              <w:rPr>
-                <w:rFonts w:eastAsia="Times New Roman" w:cs="Times New Roman"/>
-                <w:color w:val="000000"/>
-                <w:sz w:val="24"/>
-                <w:szCs w:val="24"/>
-                <w:lang w:val="vi-VN"/>
-              </w:rPr>
-              <w:t>Mã huyện, quận</w:t>
-            </w:r>
-            <w:r>
-              <w:rPr>
-                <w:rFonts w:eastAsia="Times New Roman" w:cs="Times New Roman"/>
-                <w:color w:val="000000"/>
-                <w:sz w:val="24"/>
-                <w:szCs w:val="24"/>
-                <w:vertAlign w:val="superscript"/>
-              </w:rPr>
-              <w:t>1</w:t>
-            </w:r>
-            <w:r>
-              <w:rPr>
-                <w:rFonts w:eastAsia="Times New Roman" w:cs="Times New Roman"/>
-                <w:color w:val="000000"/>
-                <w:sz w:val="24"/>
-                <w:szCs w:val="24"/>
-                <w:lang w:val="vi-VN"/>
-              </w:rPr>
-              <w:t>: {addressCode}</w:t>
-            </w:r>
-          </w:p>
-        </w:tc>
-        <w:tc>
-          <w:tcPr>
-            <w:tcW w:w="407" w:type="dxa"/>
-            <w:tcBorders>
-              <w:top w:val="single" w:sz="8" w:space="0" w:color="auto"/>
-              <w:left w:val="nil"/>
-              <w:bottom w:val="single" w:sz="8" w:space="0" w:color="auto"/>
-              <w:right w:val="single" w:sz="8" w:space="0" w:color="auto"/>
-            </w:tcBorders>
-            <w:shd w:val="clear" w:color="auto" w:fill="FFFFFF"/>
-            <w:hideMark/>
-          </w:tcPr>
-          <w:p>
-            <w:pPr>
-              <w:spacing w:before="120" w:after="120" w:line="234" w:lineRule="atLeast"/>
-              <w:rPr>
-                <w:rFonts w:eastAsia="Times New Roman" w:cs="Times New Roman"/>
-                <w:color w:val="000000"/>
-                <w:sz w:val="24"/>
-                <w:szCs w:val="24"/>
-              </w:rPr>
-            </w:pPr>
-            <w:r>
-              <w:rPr>
-                <w:rFonts w:eastAsia="Times New Roman" w:cs="Times New Roman"/>
-                <w:color w:val="000000"/>
-                <w:sz w:val="24"/>
-                <w:szCs w:val="24"/>
-              </w:rPr>
-              <w:t> </w:t>
-            </w:r>
-          </w:p>
-        </w:tc>
-        <w:tc>
-          <w:tcPr>
-            <w:tcW w:w="407" w:type="dxa"/>
-            <w:tcBorders>
-              <w:top w:val="single" w:sz="8" w:space="0" w:color="auto"/>
-              <w:left w:val="nil"/>
-              <w:bottom w:val="single" w:sz="8" w:space="0" w:color="auto"/>
-              <w:right w:val="single" w:sz="8" w:space="0" w:color="auto"/>
-            </w:tcBorders>
-            <w:shd w:val="clear" w:color="auto" w:fill="FFFFFF"/>
-            <w:hideMark/>
-          </w:tcPr>
-          <w:p>
-            <w:pPr>
-              <w:spacing w:before="120" w:after="120" w:line="234" w:lineRule="atLeast"/>
-              <w:rPr>
-                <w:rFonts w:eastAsia="Times New Roman" w:cs="Times New Roman"/>
-                <w:color w:val="000000"/>
-                <w:sz w:val="24"/>
-                <w:szCs w:val="24"/>
-              </w:rPr>
-            </w:pPr>
-            <w:r>
-              <w:rPr>
-                <w:rFonts w:eastAsia="Times New Roman" w:cs="Times New Roman"/>
-                <w:color w:val="000000"/>
-                <w:sz w:val="24"/>
-                <w:szCs w:val="24"/>
-              </w:rPr>
-              <w:t> </w:t>
-            </w:r>
-          </w:p>
-        </w:tc>
-        <w:tc>
-          <w:tcPr>
-            <w:tcW w:w="407" w:type="dxa"/>
-            <w:tcBorders>
-              <w:top w:val="single" w:sz="8" w:space="0" w:color="auto"/>
-              <w:left w:val="nil"/>
-              <w:bottom w:val="single" w:sz="8" w:space="0" w:color="auto"/>
-              <w:right w:val="single" w:sz="8" w:space="0" w:color="auto"/>
-            </w:tcBorders>
-            <w:shd w:val="clear" w:color="auto" w:fill="FFFFFF"/>
-            <w:hideMark/>
-          </w:tcPr>
-          <w:p>
-            <w:pPr>
-              <w:spacing w:before="120" w:after="120" w:line="234" w:lineRule="atLeast"/>
-              <w:rPr>
-                <w:rFonts w:eastAsia="Times New Roman" w:cs="Times New Roman"/>
-                <w:color w:val="000000"/>
-                <w:sz w:val="24"/>
-                <w:szCs w:val="24"/>
-              </w:rPr>
-            </w:pPr>
-            <w:r>
-              <w:rPr>
-                <w:rFonts w:eastAsia="Times New Roman" w:cs="Times New Roman"/>
-                <w:color w:val="000000"/>
-                <w:sz w:val="24"/>
-                <w:szCs w:val="24"/>
-              </w:rPr>
-              <w:t> </w:t>
-            </w:r>
-          </w:p>
-        </w:tc>
-        <w:tc>
-          <w:tcPr>
-            <w:tcW w:w="407" w:type="dxa"/>
-            <w:tcBorders>
-              <w:top w:val="single" w:sz="8" w:space="0" w:color="auto"/>
-              <w:left w:val="nil"/>
-              <w:bottom w:val="single" w:sz="8" w:space="0" w:color="auto"/>
-              <w:right w:val="single" w:sz="8" w:space="0" w:color="auto"/>
-            </w:tcBorders>
-            <w:shd w:val="clear" w:color="auto" w:fill="FFFFFF"/>
-            <w:hideMark/>
-          </w:tcPr>
-          <w:p>
-            <w:pPr>
-              <w:spacing w:before="120" w:after="120" w:line="234" w:lineRule="atLeast"/>
-              <w:rPr>
-                <w:rFonts w:eastAsia="Times New Roman" w:cs="Times New Roman"/>
-                <w:color w:val="000000"/>
-                <w:sz w:val="24"/>
-                <w:szCs w:val="24"/>
-              </w:rPr>
-            </w:pPr>
-            <w:r>
-              <w:rPr>
-                <w:rFonts w:eastAsia="Times New Roman" w:cs="Times New Roman"/>
-                <w:color w:val="000000"/>
-                <w:sz w:val="24"/>
-                <w:szCs w:val="24"/>
-              </w:rPr>
-              <w:t> </w:t>
             </w:r>
           </w:p>
         </w:tc>
@@ -445,7 +254,7 @@
           <w:sz w:val="24"/>
           <w:szCs w:val="24"/>
         </w:rPr>
-        <w:t xml:space="preserve"> {reportDate}</w:t>
+        <w:t> {reportDate}</w:t>
       </w:r>
     </w:p>
     <w:tbl>
@@ -461,10 +270,10 @@
       </w:tblPr>
       <w:tblGrid>
         <w:gridCol w:w="6948"/>
-        <w:gridCol w:w="477"/>
-        <w:gridCol w:w="477"/>
-        <w:gridCol w:w="477"/>
-        <w:gridCol w:w="477"/>
+        <w:gridCol w:w="910"/>
+        <w:gridCol w:w="910"/>
+        <w:gridCol w:w="910"/>
+        <w:gridCol w:w="910"/>
       </w:tblGrid>
       <w:tr>
         <w:trPr>
@@ -545,7 +354,7 @@
                 <w:szCs w:val="24"/>
                 <w:lang w:val="vi-VN"/>
               </w:rPr>
-              <w:t>Mã loại hình cơ sở: {typeCode}</w:t>
+              <w:t xml:space="preserve">Mã loại hình cơ sở: </w:t>
             </w:r>
           </w:p>
         </w:tc>
@@ -568,23 +377,8 @@
             <w:hideMark/>
           </w:tcPr>
           <w:p>
-            <w:pPr>
-              <w:spacing w:before="120" w:after="120" w:line="234" w:lineRule="atLeast"/>
-              <w:rPr>
-                <w:rFonts w:eastAsia="Times New Roman" w:cs="Times New Roman"/>
-                <w:color w:val="000000"/>
-                <w:sz w:val="24"/>
-                <w:szCs w:val="24"/>
-              </w:rPr>
-            </w:pPr>
-            <w:r>
-              <w:rPr>
-                <w:rFonts w:eastAsia="Times New Roman" w:cs="Times New Roman"/>
-                <w:color w:val="000000"/>
-                <w:sz w:val="24"/>
-                <w:szCs w:val="24"/>
-              </w:rPr>
-              <w:t> </w:t>
+            <w:r>
+              <w:t>{tC1}</w:t>
             </w:r>
           </w:p>
         </w:tc>
@@ -607,23 +401,8 @@
             <w:hideMark/>
           </w:tcPr>
           <w:p>
-            <w:pPr>
-              <w:spacing w:before="120" w:after="120" w:line="234" w:lineRule="atLeast"/>
-              <w:rPr>
-                <w:rFonts w:eastAsia="Times New Roman" w:cs="Times New Roman"/>
-                <w:color w:val="000000"/>
-                <w:sz w:val="24"/>
-                <w:szCs w:val="24"/>
-              </w:rPr>
-            </w:pPr>
-            <w:r>
-              <w:rPr>
-                <w:rFonts w:eastAsia="Times New Roman" w:cs="Times New Roman"/>
-                <w:color w:val="000000"/>
-                <w:sz w:val="24"/>
-                <w:szCs w:val="24"/>
-              </w:rPr>
-              <w:t> </w:t>
+            <w:r>
+              <w:t>{tC2}</w:t>
             </w:r>
           </w:p>
         </w:tc>
@@ -646,23 +425,8 @@
             <w:hideMark/>
           </w:tcPr>
           <w:p>
-            <w:pPr>
-              <w:spacing w:before="120" w:after="120" w:line="234" w:lineRule="atLeast"/>
-              <w:rPr>
-                <w:rFonts w:eastAsia="Times New Roman" w:cs="Times New Roman"/>
-                <w:color w:val="000000"/>
-                <w:sz w:val="24"/>
-                <w:szCs w:val="24"/>
-              </w:rPr>
-            </w:pPr>
-            <w:r>
-              <w:rPr>
-                <w:rFonts w:eastAsia="Times New Roman" w:cs="Times New Roman"/>
-                <w:color w:val="000000"/>
-                <w:sz w:val="24"/>
-                <w:szCs w:val="24"/>
-              </w:rPr>
-              <w:t> </w:t>
+            <w:r>
+              <w:t>{tC3}</w:t>
             </w:r>
           </w:p>
         </w:tc>
@@ -685,23 +449,8 @@
             <w:hideMark/>
           </w:tcPr>
           <w:p>
-            <w:pPr>
-              <w:spacing w:before="120" w:after="120" w:line="234" w:lineRule="atLeast"/>
-              <w:rPr>
-                <w:rFonts w:eastAsia="Times New Roman" w:cs="Times New Roman"/>
-                <w:color w:val="000000"/>
-                <w:sz w:val="24"/>
-                <w:szCs w:val="24"/>
-              </w:rPr>
-            </w:pPr>
-            <w:r>
-              <w:rPr>
-                <w:rFonts w:eastAsia="Times New Roman" w:cs="Times New Roman"/>
-                <w:color w:val="000000"/>
-                <w:sz w:val="24"/>
-                <w:szCs w:val="24"/>
-              </w:rPr>
-              <w:t> </w:t>
+            <w:r>
+              <w:t>{tC4}</w:t>
             </w:r>
           </w:p>
         </w:tc>
@@ -742,10 +491,10 @@
       </w:tblPr>
       <w:tblGrid>
         <w:gridCol w:w="6948"/>
-        <w:gridCol w:w="477"/>
-        <w:gridCol w:w="477"/>
-        <w:gridCol w:w="477"/>
-        <w:gridCol w:w="477"/>
+        <w:gridCol w:w="925"/>
+        <w:gridCol w:w="925"/>
+        <w:gridCol w:w="925"/>
+        <w:gridCol w:w="925"/>
       </w:tblGrid>
       <w:tr>
         <w:trPr>
@@ -814,17 +563,9 @@
                 <w:color w:val="000000"/>
                 <w:sz w:val="24"/>
                 <w:szCs w:val="24"/>
-              </w:rPr>
-            </w:r>
-            <w:r>
-              <w:rPr>
-                <w:rFonts w:eastAsia="Times New Roman" w:cs="Times New Roman"/>
-                <w:color w:val="000000"/>
-                <w:sz w:val="24"/>
-                <w:szCs w:val="24"/>
-                <w:lang w:val="vi-VN"/>
-              </w:rPr>
-              <w:t xml:space="preserve"> Mã lĩnh vực: {fieldCode}</w:t>
+                <w:lang w:val="vi-VN"/>
+              </w:rPr>
+              <w:t xml:space="preserve"> Mã lĩnh vực: </w:t>
             </w:r>
           </w:p>
         </w:tc>
@@ -847,23 +588,8 @@
             <w:hideMark/>
           </w:tcPr>
           <w:p>
-            <w:pPr>
-              <w:spacing w:before="120" w:after="120" w:line="234" w:lineRule="atLeast"/>
-              <w:rPr>
-                <w:rFonts w:eastAsia="Times New Roman" w:cs="Times New Roman"/>
-                <w:color w:val="000000"/>
-                <w:sz w:val="24"/>
-                <w:szCs w:val="24"/>
-              </w:rPr>
-            </w:pPr>
-            <w:r>
-              <w:rPr>
-                <w:rFonts w:eastAsia="Times New Roman" w:cs="Times New Roman"/>
-                <w:color w:val="000000"/>
-                <w:sz w:val="24"/>
-                <w:szCs w:val="24"/>
-              </w:rPr>
-              <w:t> </w:t>
+            <w:r>
+              <w:t>{fC1}</w:t>
             </w:r>
           </w:p>
         </w:tc>
@@ -886,23 +612,8 @@
             <w:hideMark/>
           </w:tcPr>
           <w:p>
-            <w:pPr>
-              <w:spacing w:before="120" w:after="120" w:line="234" w:lineRule="atLeast"/>
-              <w:rPr>
-                <w:rFonts w:eastAsia="Times New Roman" w:cs="Times New Roman"/>
-                <w:color w:val="000000"/>
-                <w:sz w:val="24"/>
-                <w:szCs w:val="24"/>
-              </w:rPr>
-            </w:pPr>
-            <w:r>
-              <w:rPr>
-                <w:rFonts w:eastAsia="Times New Roman" w:cs="Times New Roman"/>
-                <w:color w:val="000000"/>
-                <w:sz w:val="24"/>
-                <w:szCs w:val="24"/>
-              </w:rPr>
-              <w:t> </w:t>
+            <w:r>
+              <w:t>{fC2}</w:t>
             </w:r>
           </w:p>
         </w:tc>
@@ -925,23 +636,8 @@
             <w:hideMark/>
           </w:tcPr>
           <w:p>
-            <w:pPr>
-              <w:spacing w:before="120" w:after="120" w:line="234" w:lineRule="atLeast"/>
-              <w:rPr>
-                <w:rFonts w:eastAsia="Times New Roman" w:cs="Times New Roman"/>
-                <w:color w:val="000000"/>
-                <w:sz w:val="24"/>
-                <w:szCs w:val="24"/>
-              </w:rPr>
-            </w:pPr>
-            <w:r>
-              <w:rPr>
-                <w:rFonts w:eastAsia="Times New Roman" w:cs="Times New Roman"/>
-                <w:color w:val="000000"/>
-                <w:sz w:val="24"/>
-                <w:szCs w:val="24"/>
-              </w:rPr>
-              <w:t> </w:t>
+            <w:r>
+              <w:t>{fC3}</w:t>
             </w:r>
           </w:p>
         </w:tc>
@@ -964,23 +660,8 @@
             <w:hideMark/>
           </w:tcPr>
           <w:p>
-            <w:pPr>
-              <w:spacing w:before="120" w:after="120" w:line="234" w:lineRule="atLeast"/>
-              <w:rPr>
-                <w:rFonts w:eastAsia="Times New Roman" w:cs="Times New Roman"/>
-                <w:color w:val="000000"/>
-                <w:sz w:val="24"/>
-                <w:szCs w:val="24"/>
-              </w:rPr>
-            </w:pPr>
-            <w:r>
-              <w:rPr>
-                <w:rFonts w:eastAsia="Times New Roman" w:cs="Times New Roman"/>
-                <w:color w:val="000000"/>
-                <w:sz w:val="24"/>
-                <w:szCs w:val="24"/>
-              </w:rPr>
-              <w:t> </w:t>
+            <w:r>
+              <w:t>{fC4}</w:t>
             </w:r>
           </w:p>
         </w:tc>
@@ -1140,19 +821,19 @@
         <w:tblLook w:val="04A0" w:firstRow="1" w:lastRow="0" w:firstColumn="1" w:lastColumn="0" w:noHBand="0" w:noVBand="1"/>
       </w:tblPr>
       <w:tblGrid>
-        <w:gridCol w:w="4067"/>
-        <w:gridCol w:w="575"/>
-        <w:gridCol w:w="721"/>
-        <w:gridCol w:w="866"/>
-        <w:gridCol w:w="1012"/>
-        <w:gridCol w:w="722"/>
-        <w:gridCol w:w="1013"/>
-        <w:gridCol w:w="722"/>
-        <w:gridCol w:w="1013"/>
-        <w:gridCol w:w="722"/>
-        <w:gridCol w:w="1013"/>
-        <w:gridCol w:w="800"/>
-        <w:gridCol w:w="1304"/>
+        <w:gridCol w:w="2305"/>
+        <w:gridCol w:w="702"/>
+        <w:gridCol w:w="915"/>
+        <w:gridCol w:w="915"/>
+        <w:gridCol w:w="915"/>
+        <w:gridCol w:w="915"/>
+        <w:gridCol w:w="915"/>
+        <w:gridCol w:w="915"/>
+        <w:gridCol w:w="915"/>
+        <w:gridCol w:w="1034"/>
+        <w:gridCol w:w="1034"/>
+        <w:gridCol w:w="1034"/>
+        <w:gridCol w:w="2036"/>
       </w:tblGrid>
       <w:tr>
         <w:trPr>
@@ -2179,18 +1860,7 @@
                 <w:szCs w:val="24"/>
                 <w:lang w:val="vi-VN"/>
               </w:rPr>
-              <w:t xml:space="preserve">Nạn nhân không thuộc </w:t>
-            </w:r>
-            <w:r>
-              <w:rPr>
-                <w:rFonts w:eastAsia="Times New Roman" w:cs="Times New Roman"/>
-                <w:color w:val="000000"/>
-                <w:sz w:val="24"/>
-                <w:szCs w:val="24"/>
-                <w:lang w:val="vi-VN"/>
-              </w:rPr>
-              <w:lastRenderedPageBreak/>
-              <w:t>quyền qu</w:t>
+              <w:t>Nạn nhân không thuộc quyền qu</w:t>
             </w:r>
             <w:r>
               <w:rPr>
@@ -2245,7 +1915,6 @@
                 <w:szCs w:val="24"/>
                 <w:lang w:val="vi-VN"/>
               </w:rPr>
-              <w:lastRenderedPageBreak/>
               <w:t>Tổng số</w:t>
             </w:r>
           </w:p>
@@ -2301,18 +1970,7 @@
                 <w:szCs w:val="24"/>
                 <w:lang w:val="vi-VN"/>
               </w:rPr>
-              <w:t xml:space="preserve">hông </w:t>
-            </w:r>
-            <w:r>
-              <w:rPr>
-                <w:rFonts w:eastAsia="Times New Roman" w:cs="Times New Roman"/>
-                <w:color w:val="000000"/>
-                <w:sz w:val="24"/>
-                <w:szCs w:val="24"/>
-                <w:lang w:val="vi-VN"/>
-              </w:rPr>
-              <w:lastRenderedPageBreak/>
-              <w:t>thuộc quyền qu</w:t>
+              <w:t>hông thuộc quyền qu</w:t>
             </w:r>
             <w:r>
               <w:rPr>
@@ -2372,7 +2030,6 @@
                 <w:szCs w:val="24"/>
                 <w:lang w:val="vi-VN"/>
               </w:rPr>
-              <w:lastRenderedPageBreak/>
               <w:t>1</w:t>
             </w:r>
           </w:p>
@@ -6292,6 +5949,7 @@
                 <w:szCs w:val="24"/>
                 <w:lang w:val="vi-VN"/>
               </w:rPr>
+              <w:lastRenderedPageBreak/>
               <w:t>b. Do người lao động</w:t>
             </w:r>
           </w:p>
@@ -7255,7 +6913,6 @@
                 <w:szCs w:val="24"/>
                 <w:lang w:val="vi-VN"/>
               </w:rPr>
-              <w:lastRenderedPageBreak/>
               <w:t>Không sử dụng phương tiện bảo vệ cá nhân</w:t>
             </w:r>
           </w:p>
@@ -8387,8 +8044,6 @@
               </w:rPr>
               <w:t> </w:t>
             </w:r>
-            <w:bookmarkStart w:id="2" w:name="_GoBack"/>
-            <w:bookmarkEnd w:id="2"/>
           </w:p>
         </w:tc>
         <w:tc>
@@ -10083,7 +9738,7 @@
               </w:rPr>
               <w:t>i Khoản 2 Điều 39 </w:t>
             </w:r>
-            <w:bookmarkStart w:id="3" w:name="tvpllink_rnkvqnahsb_13"/>
+            <w:bookmarkStart w:id="2" w:name="tvpllink_rnkvqnahsb_13"/>
             <w:r>
               <w:rPr>
                 <w:rFonts w:eastAsia="Times New Roman" w:cs="Times New Roman"/>
@@ -10107,6 +9762,17 @@
                 <w:lang w:val="vi-VN"/>
               </w:rPr>
               <w:instrText xml:space="preserve"> HYPERLINK "https://thuvienphapluat.vn/van-ban/Lao-dong-Tien-luong/Luat-an-toan-ve-sinh-lao-dong-2015-281961.aspx" \t "_blank" </w:instrText>
+            </w:r>
+            <w:r>
+              <w:rPr>
+                <w:rFonts w:eastAsia="Times New Roman" w:cs="Times New Roman"/>
+                <w:b/>
+                <w:bCs/>
+                <w:color w:val="000000"/>
+                <w:sz w:val="24"/>
+                <w:szCs w:val="24"/>
+                <w:lang w:val="vi-VN"/>
+              </w:rPr>
             </w:r>
             <w:r>
               <w:rPr>
@@ -10145,7 +9811,7 @@
               </w:rPr>
               <w:fldChar w:fldCharType="end"/>
             </w:r>
-            <w:bookmarkEnd w:id="3"/>
+            <w:bookmarkEnd w:id="2"/>
           </w:p>
         </w:tc>
         <w:tc>
@@ -11098,6 +10764,7 @@
                 <w:szCs w:val="24"/>
                 <w:lang w:val="vi-VN"/>
               </w:rPr>
+              <w:lastRenderedPageBreak/>
               <w:t>Tổng số ngày nghỉ vì tai nạn lao động (kể cả ngày nghỉ chế độ)</w:t>
             </w:r>
           </w:p>
@@ -11757,9 +11424,12 @@
         </w:tc>
       </w:tr>
       <w:tr>
-        <w:tc>
-          <w:tcPr>
-            <w:tcW w:type="dxa" w:w="2376"/>
+        <w:trPr>
+          <w:tblCellSpacing w:w="0" w:type="dxa"/>
+        </w:trPr>
+        <w:tc>
+          <w:tcPr>
+            <w:tcW w:w="2376" w:type="dxa"/>
           </w:tcPr>
           <w:p>
             <w:r>
@@ -11769,7 +11439,7 @@
         </w:tc>
         <w:tc>
           <w:tcPr>
-            <w:tcW w:type="dxa" w:w="2376"/>
+            <w:tcW w:w="2376" w:type="dxa"/>
           </w:tcPr>
           <w:p>
             <w:r>
@@ -11779,7 +11449,7 @@
         </w:tc>
         <w:tc>
           <w:tcPr>
-            <w:tcW w:type="dxa" w:w="2079"/>
+            <w:tcW w:w="2079" w:type="dxa"/>
           </w:tcPr>
           <w:p>
             <w:r>
@@ -11789,7 +11459,7 @@
         </w:tc>
         <w:tc>
           <w:tcPr>
-            <w:tcW w:type="dxa" w:w="1930"/>
+            <w:tcW w:w="1930" w:type="dxa"/>
           </w:tcPr>
           <w:p>
             <w:r>
@@ -11799,7 +11469,7 @@
         </w:tc>
         <w:tc>
           <w:tcPr>
-            <w:tcW w:type="dxa" w:w="2672"/>
+            <w:tcW w:w="2672" w:type="dxa"/>
           </w:tcPr>
           <w:p>
             <w:r>
@@ -11809,7 +11479,7 @@
         </w:tc>
         <w:tc>
           <w:tcPr>
-            <w:tcW w:type="dxa" w:w="3117"/>
+            <w:tcW w:w="3117" w:type="dxa"/>
           </w:tcPr>
           <w:p>
             <w:r>
@@ -11888,7 +11558,6 @@
                 <w:sz w:val="24"/>
                 <w:szCs w:val="24"/>
               </w:rPr>
-              <w:lastRenderedPageBreak/>
               <w:t> </w:t>
             </w:r>
           </w:p>
@@ -11958,7 +11627,7 @@
                 <w:sz w:val="24"/>
                 <w:szCs w:val="24"/>
               </w:rPr>
-              <w:t>ý</w:t>
+              <w:t>ý, ghi rõ họ tên, chức vụ</w:t>
             </w:r>
             <w:r>
               <w:rPr>
@@ -11971,29 +11640,6 @@
                 <w:lang w:val="vi-VN"/>
               </w:rPr>
               <w:t>, đóng dấu)</w:t>
-              <w:br/>
-              <w:t>{headOfEnterprise}</w:t>
-            </w:r>
-            <w:r>
-              <w:rPr>
-                <w:rFonts w:eastAsia="Times New Roman" w:cs="Times New Roman"/>
-                <w:i/>
-                <w:iCs/>
-                <w:color w:val="000000"/>
-                <w:sz w:val="24"/>
-                <w:szCs w:val="24"/>
-              </w:rPr>
-            </w:r>
-            <w:r>
-              <w:rPr>
-                <w:rFonts w:eastAsia="Times New Roman" w:cs="Times New Roman"/>
-                <w:i/>
-                <w:iCs/>
-                <w:color w:val="000000"/>
-                <w:sz w:val="24"/>
-                <w:szCs w:val="24"/>
-                <w:lang w:val="vi-VN"/>
-              </w:rPr>
             </w:r>
           </w:p>
         </w:tc>
@@ -12044,7 +11690,7 @@
         </w:rPr>
         <w:t>1 Ghi mã số theo Danh Mục đơn vị hành chính do Thủ tướng Chính phủ ban hành theo quy định của </w:t>
       </w:r>
-      <w:bookmarkStart w:id="4" w:name="tvpllink_byllmhywoj_6"/>
+      <w:bookmarkStart w:id="3" w:name="tvpllink_byllmhywoj_6"/>
       <w:r>
         <w:rPr>
           <w:rFonts w:eastAsia="Times New Roman" w:cs="Times New Roman"/>
@@ -12064,6 +11710,15 @@
           <w:lang w:val="vi-VN"/>
         </w:rPr>
         <w:instrText xml:space="preserve"> HYPERLINK "https://thuvienphapluat.vn/van-ban/Bo-may-hanh-chinh/Luat-thong-ke-2015-298370.aspx" \t "_blank" </w:instrText>
+      </w:r>
+      <w:r>
+        <w:rPr>
+          <w:rFonts w:eastAsia="Times New Roman" w:cs="Times New Roman"/>
+          <w:color w:val="000000"/>
+          <w:sz w:val="24"/>
+          <w:szCs w:val="24"/>
+          <w:lang w:val="vi-VN"/>
+        </w:rPr>
       </w:r>
       <w:r>
         <w:rPr>
@@ -12096,7 +11751,7 @@
         </w:rPr>
         <w:fldChar w:fldCharType="end"/>
       </w:r>
-      <w:bookmarkEnd w:id="4"/>
+      <w:bookmarkEnd w:id="3"/>
       <w:r>
         <w:rPr>
           <w:rFonts w:eastAsia="Times New Roman" w:cs="Times New Roman"/>
@@ -12162,7 +11817,7 @@
         </w:rPr>
         <w:t>3 Ghi tên ngành, mã ngành theo Hệ thống ngành kinh tế do Thủ tướng Chính phủ ban hành theo quy định của </w:t>
       </w:r>
-      <w:bookmarkStart w:id="5" w:name="tvpllink_byllmhywoj_7"/>
+      <w:bookmarkStart w:id="4" w:name="tvpllink_byllmhywoj_7"/>
       <w:r>
         <w:rPr>
           <w:rFonts w:eastAsia="Times New Roman" w:cs="Times New Roman"/>
@@ -12182,6 +11837,15 @@
           <w:lang w:val="vi-VN"/>
         </w:rPr>
         <w:instrText xml:space="preserve"> HYPERLINK "https://thuvienphapluat.vn/van-ban/Bo-may-hanh-chinh/Luat-thong-ke-2015-298370.aspx" \t "_blank" </w:instrText>
+      </w:r>
+      <w:r>
+        <w:rPr>
+          <w:rFonts w:eastAsia="Times New Roman" w:cs="Times New Roman"/>
+          <w:color w:val="000000"/>
+          <w:sz w:val="24"/>
+          <w:szCs w:val="24"/>
+          <w:lang w:val="vi-VN"/>
+        </w:rPr>
       </w:r>
       <w:r>
         <w:rPr>
@@ -12214,7 +11878,7 @@
         </w:rPr>
         <w:fldChar w:fldCharType="end"/>
       </w:r>
-      <w:bookmarkEnd w:id="5"/>
+      <w:bookmarkEnd w:id="4"/>
       <w:r>
         <w:rPr>
           <w:rFonts w:eastAsia="Times New Roman" w:cs="Times New Roman"/>
@@ -12312,7 +11976,7 @@
         </w:rPr>
         <w:t>6 Ghi tên và mã số nghề nghiệp theo danh Mục nghề nghiệp do Thủ tướng Chính phủ ban hành theo quy định của </w:t>
       </w:r>
-      <w:bookmarkStart w:id="6" w:name="tvpllink_byllmhywoj_8"/>
+      <w:bookmarkStart w:id="5" w:name="tvpllink_byllmhywoj_8"/>
       <w:r>
         <w:rPr>
           <w:rFonts w:eastAsia="Times New Roman" w:cs="Times New Roman"/>
@@ -12332,6 +11996,15 @@
           <w:lang w:val="vi-VN"/>
         </w:rPr>
         <w:instrText xml:space="preserve"> HYPERLINK "https://thuvienphapluat.vn/van-ban/Bo-may-hanh-chinh/Luat-thong-ke-2015-298370.aspx" \t "_blank" </w:instrText>
+      </w:r>
+      <w:r>
+        <w:rPr>
+          <w:rFonts w:eastAsia="Times New Roman" w:cs="Times New Roman"/>
+          <w:color w:val="000000"/>
+          <w:sz w:val="24"/>
+          <w:szCs w:val="24"/>
+          <w:lang w:val="vi-VN"/>
+        </w:rPr>
       </w:r>
       <w:r>
         <w:rPr>
@@ -12364,7 +12037,7 @@
         </w:rPr>
         <w:fldChar w:fldCharType="end"/>
       </w:r>
-      <w:bookmarkEnd w:id="6"/>
+      <w:bookmarkEnd w:id="5"/>
       <w:r>
         <w:rPr>
           <w:rFonts w:eastAsia="Times New Roman" w:cs="Times New Roman"/>
@@ -12396,7 +12069,7 @@
 </file>
 
 <file path=word/styles.xml><?xml version="1.0" encoding="utf-8"?>
-<w:styles xmlns:mc="http://schemas.openxmlformats.org/markup-compatibility/2006" xmlns:r="http://schemas.openxmlformats.org/officeDocument/2006/relationships" xmlns:w="http://schemas.openxmlformats.org/wordprocessingml/2006/main" xmlns:w14="http://schemas.microsoft.com/office/word/2010/wordml" xmlns:w15="http://schemas.microsoft.com/office/word/2012/wordml" xmlns:w16se="http://schemas.microsoft.com/office/word/2015/wordml/symex" mc:Ignorable="w14 w15 w16se">
+<w:styles xmlns:mc="http://schemas.openxmlformats.org/markup-compatibility/2006" xmlns:r="http://schemas.openxmlformats.org/officeDocument/2006/relationships" xmlns:w="http://schemas.openxmlformats.org/wordprocessingml/2006/main" xmlns:w14="http://schemas.microsoft.com/office/word/2010/wordml" xmlns:w15="http://schemas.microsoft.com/office/word/2012/wordml" xmlns:w16cex="http://schemas.microsoft.com/office/word/2018/wordml/cex" xmlns:w16cid="http://schemas.microsoft.com/office/word/2016/wordml/cid" xmlns:w16="http://schemas.microsoft.com/office/word/2018/wordml" xmlns:w16du="http://schemas.microsoft.com/office/word/2023/wordml/word16du" xmlns:w16sdtdh="http://schemas.microsoft.com/office/word/2020/wordml/sdtdatahash" xmlns:w16sdtfl="http://schemas.microsoft.com/office/word/2024/wordml/sdtformatlock" xmlns:w16se="http://schemas.microsoft.com/office/word/2015/wordml/symex" mc:Ignorable="w14 w15 w16se w16cid w16 w16cex w16sdtdh w16sdtfl w16du">
   <w:docDefaults>
     <w:rPrDefault>
       <w:rPr>
@@ -12412,7 +12085,7 @@
       </w:pPr>
     </w:pPrDefault>
   </w:docDefaults>
-  <w:latentStyles w:defLockedState="0" w:defUIPriority="99" w:defSemiHidden="0" w:defUnhideWhenUsed="0" w:defQFormat="0" w:count="371">
+  <w:latentStyles w:defLockedState="0" w:defUIPriority="99" w:defSemiHidden="0" w:defUnhideWhenUsed="0" w:defQFormat="0" w:count="376">
     <w:lsdException w:name="Normal" w:uiPriority="0" w:qFormat="1"/>
     <w:lsdException w:name="heading 1" w:uiPriority="9" w:qFormat="1"/>
     <w:lsdException w:name="heading 2" w:semiHidden="1" w:uiPriority="9" w:unhideWhenUsed="1" w:qFormat="1"/>
@@ -12784,6 +12457,11 @@
     <w:lsdException w:name="List Table 5 Dark Accent 6" w:uiPriority="50"/>
     <w:lsdException w:name="List Table 6 Colorful Accent 6" w:uiPriority="51"/>
     <w:lsdException w:name="List Table 7 Colorful Accent 6" w:uiPriority="52"/>
+    <w:lsdException w:name="Mention" w:semiHidden="1" w:unhideWhenUsed="1"/>
+    <w:lsdException w:name="Smart Hyperlink" w:semiHidden="1" w:unhideWhenUsed="1"/>
+    <w:lsdException w:name="Hashtag" w:semiHidden="1" w:unhideWhenUsed="1"/>
+    <w:lsdException w:name="Unresolved Mention" w:semiHidden="1" w:unhideWhenUsed="1"/>
+    <w:lsdException w:name="Smart Link" w:semiHidden="1" w:unhideWhenUsed="1"/>
   </w:latentStyles>
   <w:style w:type="paragraph" w:default="1" w:styleId="Normal">
     <w:name w:val="Normal"/>

</xml_diff>

<commit_message>
Chỉnh về mã phường xã
</commit_message>
<xml_diff>
--- a/fe/public/template.docx
+++ b/fe/public/template.docx
@@ -98,7 +98,7 @@
     </w:p>
     <w:tbl>
       <w:tblPr>
-        <w:tblW w:w="2878" w:type="dxa"/>
+        <w:tblW w:w="8280" w:type="dxa"/>
         <w:tblCellSpacing w:w="0" w:type="dxa"/>
         <w:tblBorders>
           <w:top w:val="outset" w:sz="6" w:space="0" w:color="auto"/>
@@ -114,7 +114,7 @@
         <w:tblLook w:val="04A0" w:firstRow="1" w:lastRow="0" w:firstColumn="1" w:lastColumn="0" w:noHBand="0" w:noVBand="1"/>
       </w:tblPr>
       <w:tblGrid>
-        <w:gridCol w:w="2878"/>
+        <w:gridCol w:w="8280"/>
       </w:tblGrid>
       <w:tr>
         <w:trPr>
@@ -122,7 +122,7 @@
         </w:trPr>
         <w:tc>
           <w:tcPr>
-            <w:tcW w:w="2878" w:type="dxa"/>
+            <w:tcW w:w="8280" w:type="dxa"/>
             <w:tcBorders>
               <w:top w:val="nil"/>
               <w:left w:val="nil"/>
@@ -133,24 +133,8 @@
             <w:hideMark/>
           </w:tcPr>
           <w:p>
-            <w:pPr>
-              <w:spacing w:before="120" w:after="120" w:line="234" w:lineRule="atLeast"/>
-              <w:rPr>
-                <w:rFonts w:eastAsia="Times New Roman" w:cs="Times New Roman"/>
-                <w:color w:val="000000"/>
-                <w:sz w:val="24"/>
-                <w:szCs w:val="24"/>
-              </w:rPr>
-            </w:pPr>
-            <w:r>
-              <w:rPr>
-                <w:rFonts w:eastAsia="Times New Roman" w:cs="Times New Roman"/>
-                <w:color w:val="000000"/>
-                <w:sz w:val="24"/>
-                <w:szCs w:val="24"/>
-                <w:lang w:val="vi-VN"/>
-              </w:rPr>
-              <w:t>Địa chỉ: {companyAddress}</w:t>
+            <w:r>
+              <w:t>Địa chỉ: {companyAddress}          Mã phường, xã: {wardCode}</w:t>
             </w:r>
           </w:p>
         </w:tc>

</xml_diff>

<commit_message>
Update form báo cáo, đồng bộ giao diện
</commit_message>
<xml_diff>
--- a/fe/public/template.docx
+++ b/fe/public/template.docx
@@ -98,14 +98,8 @@
     </w:p>
     <w:tbl>
       <w:tblPr>
-        <w:tblW w:w="8280" w:type="dxa"/>
+        <w:tblW w:w="0" w:type="auto"/>
         <w:tblCellSpacing w:w="0" w:type="dxa"/>
-        <w:tblBorders>
-          <w:top w:val="outset" w:sz="6" w:space="0" w:color="auto"/>
-          <w:left w:val="outset" w:sz="6" w:space="0" w:color="auto"/>
-          <w:bottom w:val="outset" w:sz="6" w:space="0" w:color="auto"/>
-          <w:right w:val="outset" w:sz="6" w:space="0" w:color="auto"/>
-        </w:tblBorders>
         <w:shd w:val="clear" w:color="auto" w:fill="FFFFFF"/>
         <w:tblCellMar>
           <w:left w:w="0" w:type="dxa"/>
@@ -114,7 +108,12 @@
         <w:tblLook w:val="04A0" w:firstRow="1" w:lastRow="0" w:firstColumn="1" w:lastColumn="0" w:noHBand="0" w:noVBand="1"/>
       </w:tblPr>
       <w:tblGrid>
-        <w:gridCol w:w="8280"/>
+        <w:gridCol w:w="4680"/>
+        <w:gridCol w:w="1034"/>
+        <w:gridCol w:w="1034"/>
+        <w:gridCol w:w="1034"/>
+        <w:gridCol w:w="1034"/>
+        <w:gridCol w:w="904"/>
       </w:tblGrid>
       <w:tr>
         <w:trPr>
@@ -122,24 +121,267 @@
         </w:trPr>
         <w:tc>
           <w:tcPr>
-            <w:tcW w:w="8280" w:type="dxa"/>
+            <w:tcW w:w="4680" w:type="dxa"/>
             <w:tcBorders>
               <w:top w:val="nil"/>
               <w:left w:val="nil"/>
               <w:bottom w:val="nil"/>
-              <w:right w:val="nil"/>
-            </w:tcBorders>
-            <w:shd w:val="clear" w:color="auto" w:fill="FFFFFF"/>
-            <w:hideMark/>
-          </w:tcPr>
-          <w:p>
-            <w:r>
-              <w:t>Địa chỉ: {companyAddress}          Mã phường, xã: {wardCode}</w:t>
+              <w:right w:val="single" w:sz="8" w:space="0" w:color="auto"/>
+            </w:tcBorders>
+            <w:shd w:val="clear" w:color="auto" w:fill="FFFFFF"/>
+            <w:tcMar>
+              <w:top w:w="0" w:type="dxa"/>
+              <w:left w:w="108" w:type="dxa"/>
+              <w:bottom w:w="0" w:type="dxa"/>
+              <w:right w:w="108" w:type="dxa"/>
+            </w:tcMar>
+            <w:hideMark/>
+          </w:tcPr>
+          <w:p>
+            <w:pPr>
+              <w:spacing w:before="120" w:after="120" w:line="234" w:lineRule="atLeast"/>
+              <w:rPr>
+                <w:rFonts w:eastAsia="Times New Roman" w:cs="Times New Roman"/>
+                <w:color w:val="000000"/>
+                <w:sz w:val="24"/>
+                <w:szCs w:val="24"/>
+              </w:rPr>
+            </w:pPr>
+            <w:r>
+              <w:rPr>
+                <w:rFonts w:eastAsia="Times New Roman" w:cs="Times New Roman"/>
+                <w:color w:val="000000"/>
+                <w:sz w:val="24"/>
+                <w:szCs w:val="24"/>
+              </w:rPr>
+              <w:t>Địa chỉ</w:t>
+            </w:r>
+            <w:r>
+              <w:rPr>
+                <w:rFonts w:eastAsia="Times New Roman" w:cs="Times New Roman"/>
+                <w:color w:val="000000"/>
+                <w:sz w:val="24"/>
+                <w:szCs w:val="24"/>
+                <w:lang w:val="vi-VN"/>
+              </w:rPr>
+              <w:t> </w:t>
+            </w:r>
+            <w:r>
+              <w:rPr>
+                <w:rFonts w:eastAsia="Times New Roman" w:cs="Times New Roman"/>
+                <w:color w:val="000000"/>
+                <w:sz w:val="24"/>
+                <w:szCs w:val="24"/>
+              </w:rPr>
+              <w:t>{company</w:t>
+            </w:r>
+            <w:r>
+              <w:rPr>
+                <w:rFonts w:eastAsia="Times New Roman" w:cs="Times New Roman"/>
+                <w:color w:val="000000"/>
+                <w:sz w:val="24"/>
+                <w:szCs w:val="24"/>
+              </w:rPr>
+              <w:t>Address</w:t>
+            </w:r>
+            <w:r>
+              <w:rPr>
+                <w:rFonts w:eastAsia="Times New Roman" w:cs="Times New Roman"/>
+                <w:color w:val="000000"/>
+                <w:sz w:val="24"/>
+                <w:szCs w:val="24"/>
+              </w:rPr>
+              <w:t xml:space="preserve">}    </w:t>
+            </w:r>
+            <w:r>
+              <w:rPr>
+                <w:rFonts w:eastAsia="Times New Roman" w:cs="Times New Roman"/>
+                <w:color w:val="000000"/>
+                <w:sz w:val="24"/>
+                <w:szCs w:val="24"/>
+                <w:lang w:val="vi-VN"/>
+              </w:rPr>
+              <w:t xml:space="preserve">Mã </w:t>
+            </w:r>
+            <w:r>
+              <w:rPr>
+                <w:rFonts w:eastAsia="Times New Roman" w:cs="Times New Roman"/>
+                <w:color w:val="000000"/>
+                <w:sz w:val="24"/>
+                <w:szCs w:val="24"/>
+              </w:rPr>
+              <w:t>phường xã</w:t>
+            </w:r>
+            <w:r>
+              <w:rPr>
+                <w:rFonts w:eastAsia="Times New Roman" w:cs="Times New Roman"/>
+                <w:color w:val="000000"/>
+                <w:sz w:val="24"/>
+                <w:szCs w:val="24"/>
+                <w:lang w:val="vi-VN"/>
+              </w:rPr>
+              <w:t xml:space="preserve">: </w:t>
+            </w:r>
+          </w:p>
+        </w:tc>
+        <w:tc>
+          <w:tcPr>
+            <w:tcW w:w="1034" w:type="dxa"/>
+            <w:tcBorders>
+              <w:top w:val="single" w:sz="8" w:space="0" w:color="auto"/>
+              <w:left w:val="nil"/>
+              <w:bottom w:val="single" w:sz="8" w:space="0" w:color="auto"/>
+              <w:right w:val="single" w:sz="8" w:space="0" w:color="auto"/>
+            </w:tcBorders>
+            <w:shd w:val="clear" w:color="auto" w:fill="FFFFFF"/>
+            <w:tcMar>
+              <w:top w:w="0" w:type="dxa"/>
+              <w:left w:w="108" w:type="dxa"/>
+              <w:bottom w:w="0" w:type="dxa"/>
+              <w:right w:w="108" w:type="dxa"/>
+            </w:tcMar>
+            <w:hideMark/>
+          </w:tcPr>
+          <w:p>
+            <w:r>
+              <w:t>{</w:t>
+            </w:r>
+            <w:r>
+              <w:t>w</w:t>
+            </w:r>
+            <w:r>
+              <w:t>C1}</w:t>
+            </w:r>
+          </w:p>
+        </w:tc>
+        <w:tc>
+          <w:tcPr>
+            <w:tcW w:w="1034" w:type="dxa"/>
+            <w:tcBorders>
+              <w:top w:val="single" w:sz="8" w:space="0" w:color="auto"/>
+              <w:left w:val="nil"/>
+              <w:bottom w:val="single" w:sz="8" w:space="0" w:color="auto"/>
+              <w:right w:val="single" w:sz="8" w:space="0" w:color="auto"/>
+            </w:tcBorders>
+            <w:shd w:val="clear" w:color="auto" w:fill="FFFFFF"/>
+            <w:tcMar>
+              <w:top w:w="0" w:type="dxa"/>
+              <w:left w:w="108" w:type="dxa"/>
+              <w:bottom w:w="0" w:type="dxa"/>
+              <w:right w:w="108" w:type="dxa"/>
+            </w:tcMar>
+            <w:hideMark/>
+          </w:tcPr>
+          <w:p>
+            <w:r>
+              <w:t>{</w:t>
+            </w:r>
+            <w:r>
+              <w:t>w</w:t>
+            </w:r>
+            <w:r>
+              <w:t>C2}</w:t>
+            </w:r>
+          </w:p>
+        </w:tc>
+        <w:tc>
+          <w:tcPr>
+            <w:tcW w:w="1034" w:type="dxa"/>
+            <w:tcBorders>
+              <w:top w:val="single" w:sz="8" w:space="0" w:color="auto"/>
+              <w:left w:val="nil"/>
+              <w:bottom w:val="single" w:sz="8" w:space="0" w:color="auto"/>
+              <w:right w:val="single" w:sz="8" w:space="0" w:color="auto"/>
+            </w:tcBorders>
+            <w:shd w:val="clear" w:color="auto" w:fill="FFFFFF"/>
+            <w:tcMar>
+              <w:top w:w="0" w:type="dxa"/>
+              <w:left w:w="108" w:type="dxa"/>
+              <w:bottom w:w="0" w:type="dxa"/>
+              <w:right w:w="108" w:type="dxa"/>
+            </w:tcMar>
+            <w:hideMark/>
+          </w:tcPr>
+          <w:p>
+            <w:r>
+              <w:t>{</w:t>
+            </w:r>
+            <w:r>
+              <w:t>w</w:t>
+            </w:r>
+            <w:r>
+              <w:t>C3}</w:t>
+            </w:r>
+          </w:p>
+        </w:tc>
+        <w:tc>
+          <w:tcPr>
+            <w:tcW w:w="1034" w:type="dxa"/>
+            <w:tcBorders>
+              <w:top w:val="single" w:sz="8" w:space="0" w:color="auto"/>
+              <w:left w:val="nil"/>
+              <w:bottom w:val="single" w:sz="8" w:space="0" w:color="auto"/>
+              <w:right w:val="single" w:sz="8" w:space="0" w:color="auto"/>
+            </w:tcBorders>
+            <w:shd w:val="clear" w:color="auto" w:fill="FFFFFF"/>
+            <w:tcMar>
+              <w:top w:w="0" w:type="dxa"/>
+              <w:left w:w="108" w:type="dxa"/>
+              <w:bottom w:w="0" w:type="dxa"/>
+              <w:right w:w="108" w:type="dxa"/>
+            </w:tcMar>
+            <w:hideMark/>
+          </w:tcPr>
+          <w:p>
+            <w:r>
+              <w:t>{</w:t>
+            </w:r>
+            <w:r>
+              <w:t>w</w:t>
+            </w:r>
+            <w:r>
+              <w:t>C4}</w:t>
+            </w:r>
+          </w:p>
+        </w:tc>
+        <w:tc>
+          <w:tcPr>
+            <w:tcW w:w="904" w:type="dxa"/>
+            <w:tcBorders>
+              <w:top w:val="single" w:sz="8" w:space="0" w:color="auto"/>
+              <w:left w:val="nil"/>
+              <w:bottom w:val="single" w:sz="8" w:space="0" w:color="auto"/>
+              <w:right w:val="single" w:sz="8" w:space="0" w:color="auto"/>
+            </w:tcBorders>
+            <w:shd w:val="clear" w:color="auto" w:fill="FFFFFF"/>
+          </w:tcPr>
+          <w:p>
+            <w:r>
+              <w:t>{wC</w:t>
+            </w:r>
+            <w:r>
+              <w:t>5</w:t>
+            </w:r>
+            <w:r>
+              <w:t>}</w:t>
             </w:r>
           </w:p>
         </w:tc>
       </w:tr>
     </w:tbl>
+    <w:p>
+      <w:pPr>
+        <w:shd w:val="clear" w:color="auto" w:fill="FFFFFF"/>
+        <w:spacing w:before="120" w:after="120" w:line="234" w:lineRule="atLeast"/>
+        <w:rPr>
+          <w:rFonts w:eastAsia="Times New Roman" w:cs="Times New Roman"/>
+          <w:b/>
+          <w:bCs/>
+          <w:color w:val="000000"/>
+          <w:sz w:val="22"/>
+        </w:rPr>
+      </w:pPr>
+    </w:p>
     <w:p>
       <w:pPr>
         <w:shd w:val="clear" w:color="auto" w:fill="FFFFFF"/>
@@ -1844,7 +2086,18 @@
                 <w:szCs w:val="24"/>
                 <w:lang w:val="vi-VN"/>
               </w:rPr>
-              <w:t>Nạn nhân không thuộc quyền qu</w:t>
+              <w:t xml:space="preserve">Nạn nhân không thuộc </w:t>
+            </w:r>
+            <w:r>
+              <w:rPr>
+                <w:rFonts w:eastAsia="Times New Roman" w:cs="Times New Roman"/>
+                <w:color w:val="000000"/>
+                <w:sz w:val="24"/>
+                <w:szCs w:val="24"/>
+                <w:lang w:val="vi-VN"/>
+              </w:rPr>
+              <w:lastRenderedPageBreak/>
+              <w:t>quyền qu</w:t>
             </w:r>
             <w:r>
               <w:rPr>
@@ -1899,6 +2152,7 @@
                 <w:szCs w:val="24"/>
                 <w:lang w:val="vi-VN"/>
               </w:rPr>
+              <w:lastRenderedPageBreak/>
               <w:t>Tổng số</w:t>
             </w:r>
           </w:p>
@@ -12450,7 +12704,7 @@
   <w:style w:type="paragraph" w:default="1" w:styleId="Normal">
     <w:name w:val="Normal"/>
     <w:qFormat/>
-    <w:rsid w:val="00047127"/>
+    <w:rsid w:val="00D04199"/>
   </w:style>
   <w:style w:type="paragraph" w:styleId="Heading2">
     <w:name w:val="heading 2"/>

</xml_diff>